<commit_message>
Downgrade project to Java 17 and harden mvnw.cmd
Align project to Java 17: update .classpath to JavaSE-17, .settings/org.eclipse.jdt.core.prefs (source, targetPlatform, compliance) and pom.xml java.version to 17; replace jakarta.xml.bind dependency with javax jaxb-api 2.4.0. Harden mvnw.cmd wrapper logic and SHA-256 validation: use proper if/else blocks, more robust PowerShell quoting and conditional checks to reliably download/validate the maven-wrapper jar. Also include updates to several uploaded .docx files under uploads/academic (binary content changes). These changes ensure compatibility with Java 17 and make the wrapper script more resilient.
</commit_message>
<xml_diff>
--- a/shopping-cart-spring-boot-main/uploads/academic/1/doc_1.docx
+++ b/shopping-cart-spring-boot-main/uploads/academic/1/doc_1.docx
@@ -485,7 +485,7 @@
                 <w:sz w:val="28"/>
                 <w:b w:val="off"/>
               </w:rPr>
-              <w:t/>
+              <w:t>☑</w:t>
             </w:r>
           </w:p>
         </w:tc>
@@ -509,7 +509,7 @@
                 <w:sz w:val="28"/>
                 <w:b w:val="off"/>
               </w:rPr>
-              <w:t>✔️</w:t>
+              <w:t>☑</w:t>
             </w:r>
           </w:p>
         </w:tc>
@@ -636,7 +636,7 @@
                 <w:sz w:val="28"/>
                 <w:b w:val="off"/>
               </w:rPr>
-              <w:t/>
+              <w:t>☑</w:t>
             </w:r>
           </w:p>
         </w:tc>
@@ -660,7 +660,7 @@
                 <w:sz w:val="28"/>
                 <w:b w:val="off"/>
               </w:rPr>
-              <w:t>✔️</w:t>
+              <w:t>☑</w:t>
             </w:r>
           </w:p>
         </w:tc>
@@ -797,7 +797,7 @@
                 <w:sz w:val="28"/>
                 <w:b w:val="off"/>
               </w:rPr>
-              <w:t/>
+              <w:t>☑</w:t>
             </w:r>
           </w:p>
         </w:tc>
@@ -821,7 +821,7 @@
                 <w:sz w:val="28"/>
                 <w:b w:val="off"/>
               </w:rPr>
-              <w:t/>
+              <w:t>☑</w:t>
             </w:r>
           </w:p>
         </w:tc>
@@ -968,7 +968,7 @@
                 <w:sz w:val="28"/>
                 <w:b w:val="off"/>
               </w:rPr>
-              <w:t/>
+              <w:t>☑</w:t>
             </w:r>
           </w:p>
         </w:tc>
@@ -992,7 +992,7 @@
                 <w:sz w:val="28"/>
                 <w:b w:val="off"/>
               </w:rPr>
-              <w:t/>
+              <w:t>☑</w:t>
             </w:r>
           </w:p>
         </w:tc>
@@ -1119,7 +1119,7 @@
                 <w:sz w:val="28"/>
                 <w:b w:val="off"/>
               </w:rPr>
-              <w:t/>
+              <w:t>☑</w:t>
             </w:r>
           </w:p>
         </w:tc>
@@ -1143,7 +1143,7 @@
                 <w:sz w:val="28"/>
                 <w:b w:val="off"/>
               </w:rPr>
-              <w:t/>
+              <w:t>☑</w:t>
             </w:r>
           </w:p>
         </w:tc>
@@ -1220,7 +1220,7 @@
           <w:sz w:val="32"/>
           <w:b w:val="off"/>
         </w:rPr>
-        <w:t xml:space="preserve">     ()				(นางสาวจิราภรณ์  หอมอ่อน)</w:t>
+        <w:t xml:space="preserve">     (kkk)				(นางสาวจิราภรณ์  หอมอ่อน)</w:t>
       </w:r>
     </w:p>
     <w:p>
@@ -1338,6 +1338,7 @@
     <w:p>
       <w:pPr>
         <w:rPr>
+          <w:rFonts w:hint="cs"/>
           <w:sz w:val="28"/>
           <w:szCs w:val="28"/>
           <w:cs/>
@@ -1757,7 +1758,6 @@
   <w:style w:type="character" w:default="1" w:styleId="DefaultParagraphFont">
     <w:name w:val="Default Paragraph Font"/>
     <w:uiPriority w:val="1"/>
-    <w:semiHidden/>
     <w:unhideWhenUsed/>
   </w:style>
   <w:style w:type="table" w:default="1" w:styleId="TableNormal">

</xml_diff>